<commit_message>
Apply consortium-play skill (live); correct MATECH MNDA entity to Global Strategic Materials, LLC
- consortium-play skill applied via 'openclaw skills workshop apply' -> skills/consortium-play/SKILL.md.
- MNDA counterparty corrected per CA SOS DD: Global Strategic Materials, LLC (d/b/a MATECH),
  a CA LLC (the active entity) instead of terminated 'MATECH GSM, Inc.'; Super Carbon affiliate
  retained; signer title -> Managing Member. Corrected copy delivered to Jon to send.

Co-Authored-By: Claude Opus 4.8 <noreply@anthropic.com>
</commit_message>
<xml_diff>
--- a/drafts/MNDA_Exos_MATECH_SIGNATURE_READY.docx
+++ b/drafts/MNDA_Exos_MATECH_SIGNATURE_READY.docx
@@ -27,7 +27,7 @@
           <w:color w:val="0B2240"/>
           <w:sz w:val="22"/>
         </w:rPr>
-        <w:t>Exos Aerospace Systems &amp; Technologies, Inc. ↔ MATECH GSM, Inc.</w:t>
+        <w:t>Exos Aerospace Systems &amp; Technologies, Inc. ↔ Global Strategic Materials, LLC (MATECH)</w:t>
       </w:r>
     </w:p>
     <w:p>
@@ -86,10 +86,10 @@
         <w:rPr>
           <w:b/>
         </w:rPr>
-        <w:t>MATECH GSM, Inc.</w:t>
-      </w:r>
-      <w:r>
-        <w:t>, a California corporation, with its principal place of business at 31304 Via Colinas, Suite 102, Westlake Village, CA 91362 ("MATECH").</w:t>
+        <w:t>Global Strategic Materials, LLC</w:t>
+      </w:r>
+      <w:r>
+        <w:t xml:space="preserve"> (d/b/a MATECH), a California limited liability company, with its principal place of business at 31304 Via Colinas, Suite 102, Westlake Village, CA 91362 ("MATECH").</w:t>
       </w:r>
     </w:p>
     <w:p/>
@@ -630,7 +630,10 @@
         <w:rPr>
           <w:b/>
         </w:rPr>
-        <w:t>MATECH GSM, INC.</w:t>
+        <w:t>GLOBAL STRATEGIC MATERIALS, LLC</w:t>
+      </w:r>
+      <w:r>
+        <w:t xml:space="preserve"> (d/b/a MATECH)</w:t>
       </w:r>
     </w:p>
     <w:p/>
@@ -655,7 +658,7 @@
         <w:spacing w:after="120"/>
       </w:pPr>
       <w:r>
-        <w:t>Title: Founder and Chief Executive Officer</w:t>
+        <w:t>Title: Founder and Managing Member</w:t>
       </w:r>
     </w:p>
     <w:p>

</xml_diff>